<commit_message>
Complete Week 2 Lab 2
</commit_message>
<xml_diff>
--- a/Fragoso_Sean_CMP129_Week02_Lab02.docx
+++ b/Fragoso_Sean_CMP129_Week02_Lab02.docx
@@ -8,13 +8,8 @@
       </w:r>
     </w:p>
     <w:p>
-      <w:proofErr w:type="gramStart"/>
-      <w:r>
-        <w:t>public</w:t>
-      </w:r>
-      <w:proofErr w:type="gramEnd"/>
-      <w:r>
-        <w:t xml:space="preserve"> class Person {</w:t>
+      <w:r>
+        <w:t>public class Person {</w:t>
       </w:r>
     </w:p>
     <w:p>
@@ -52,17 +47,12 @@
         <w:t xml:space="preserve"> (String), </w:t>
       </w:r>
       <w:proofErr w:type="spellStart"/>
-      <w:proofErr w:type="gramStart"/>
       <w:r>
         <w:t>getName</w:t>
       </w:r>
       <w:proofErr w:type="spellEnd"/>
       <w:r>
-        <w:t>(</w:t>
-      </w:r>
-      <w:proofErr w:type="gramEnd"/>
-      <w:r>
-        <w:t>)</w:t>
+        <w:t>()</w:t>
       </w:r>
     </w:p>
     <w:p>
@@ -78,17 +68,12 @@
         <w:t xml:space="preserve"> (int), </w:t>
       </w:r>
       <w:proofErr w:type="spellStart"/>
-      <w:proofErr w:type="gramStart"/>
       <w:r>
         <w:t>getAge</w:t>
       </w:r>
       <w:proofErr w:type="spellEnd"/>
       <w:r>
-        <w:t>(</w:t>
-      </w:r>
-      <w:proofErr w:type="gramEnd"/>
-      <w:r>
-        <w:t>)</w:t>
+        <w:t>()</w:t>
       </w:r>
     </w:p>
     <w:p>
@@ -104,17 +89,12 @@
         <w:t xml:space="preserve"> (String), </w:t>
       </w:r>
       <w:proofErr w:type="spellStart"/>
-      <w:proofErr w:type="gramStart"/>
       <w:r>
         <w:t>getEmail</w:t>
       </w:r>
       <w:proofErr w:type="spellEnd"/>
       <w:r>
-        <w:t>(</w:t>
-      </w:r>
-      <w:proofErr w:type="gramEnd"/>
-      <w:r>
-        <w:t>)</w:t>
+        <w:t>()</w:t>
       </w:r>
     </w:p>
     <w:p/>
@@ -123,17 +103,12 @@
         <w:t>    //</w:t>
       </w:r>
       <w:proofErr w:type="spellStart"/>
-      <w:proofErr w:type="gramStart"/>
       <w:r>
         <w:t>displayinfo</w:t>
       </w:r>
       <w:proofErr w:type="spellEnd"/>
       <w:r>
-        <w:t>(</w:t>
-      </w:r>
-      <w:proofErr w:type="gramEnd"/>
-      <w:r>
-        <w:t>)</w:t>
+        <w:t>()</w:t>
       </w:r>
     </w:p>
     <w:p/>
@@ -158,23 +133,13 @@
         <w:t xml:space="preserve">    public void </w:t>
       </w:r>
       <w:proofErr w:type="spellStart"/>
-      <w:proofErr w:type="gramStart"/>
       <w:r>
         <w:t>setName</w:t>
       </w:r>
       <w:proofErr w:type="spellEnd"/>
       <w:r>
-        <w:t>(</w:t>
-      </w:r>
-      <w:proofErr w:type="gramEnd"/>
-      <w:r>
-        <w:t xml:space="preserve">String </w:t>
-      </w:r>
-      <w:proofErr w:type="gramStart"/>
-      <w:r>
-        <w:t>n){</w:t>
-      </w:r>
-      <w:proofErr w:type="gramEnd"/>
+        <w:t>(String n){</w:t>
+      </w:r>
     </w:p>
     <w:p>
       <w:r>
@@ -192,7 +157,6 @@
         <w:t xml:space="preserve">    public String </w:t>
       </w:r>
       <w:proofErr w:type="spellStart"/>
-      <w:proofErr w:type="gramStart"/>
       <w:r>
         <w:t>getName</w:t>
       </w:r>
@@ -200,7 +164,6 @@
       <w:r>
         <w:t>(){</w:t>
       </w:r>
-      <w:proofErr w:type="gramEnd"/>
     </w:p>
     <w:p>
       <w:r>
@@ -219,23 +182,13 @@
         <w:t xml:space="preserve">    public void </w:t>
       </w:r>
       <w:proofErr w:type="spellStart"/>
-      <w:proofErr w:type="gramStart"/>
       <w:r>
         <w:t>setAge</w:t>
       </w:r>
       <w:proofErr w:type="spellEnd"/>
       <w:r>
-        <w:t>(</w:t>
-      </w:r>
-      <w:proofErr w:type="gramEnd"/>
-      <w:r>
-        <w:t xml:space="preserve">int </w:t>
-      </w:r>
-      <w:proofErr w:type="gramStart"/>
-      <w:r>
-        <w:t>a){</w:t>
-      </w:r>
-      <w:proofErr w:type="gramEnd"/>
+        <w:t>(int a){</w:t>
+      </w:r>
     </w:p>
     <w:p>
       <w:r>
@@ -253,7 +206,6 @@
         <w:t xml:space="preserve">    public int </w:t>
       </w:r>
       <w:proofErr w:type="spellStart"/>
-      <w:proofErr w:type="gramStart"/>
       <w:r>
         <w:t>getAge</w:t>
       </w:r>
@@ -261,7 +213,6 @@
       <w:r>
         <w:t>(){</w:t>
       </w:r>
-      <w:proofErr w:type="gramEnd"/>
     </w:p>
     <w:p>
       <w:r>
@@ -279,23 +230,13 @@
         <w:t xml:space="preserve">    public void </w:t>
       </w:r>
       <w:proofErr w:type="spellStart"/>
-      <w:proofErr w:type="gramStart"/>
       <w:r>
         <w:t>setEmail</w:t>
       </w:r>
       <w:proofErr w:type="spellEnd"/>
       <w:r>
-        <w:t>(</w:t>
-      </w:r>
-      <w:proofErr w:type="gramEnd"/>
-      <w:r>
-        <w:t xml:space="preserve">String </w:t>
-      </w:r>
-      <w:proofErr w:type="gramStart"/>
-      <w:r>
-        <w:t>e){</w:t>
-      </w:r>
-      <w:proofErr w:type="gramEnd"/>
+        <w:t>(String e){</w:t>
+      </w:r>
     </w:p>
     <w:p>
       <w:r>
@@ -313,7 +254,6 @@
         <w:t xml:space="preserve">    public String </w:t>
       </w:r>
       <w:proofErr w:type="spellStart"/>
-      <w:proofErr w:type="gramStart"/>
       <w:r>
         <w:t>getEmail</w:t>
       </w:r>
@@ -321,7 +261,6 @@
       <w:r>
         <w:t>(){</w:t>
       </w:r>
-      <w:proofErr w:type="gramEnd"/>
     </w:p>
     <w:p>
       <w:r>
@@ -350,7 +289,6 @@
         <w:t xml:space="preserve">    public void </w:t>
       </w:r>
       <w:proofErr w:type="spellStart"/>
-      <w:proofErr w:type="gramStart"/>
       <w:r>
         <w:t>displayinfo</w:t>
       </w:r>
@@ -358,7 +296,6 @@
       <w:r>
         <w:t>(){</w:t>
       </w:r>
-      <w:proofErr w:type="gramEnd"/>
     </w:p>
     <w:p>
       <w:r>
@@ -373,43 +310,28 @@
         <w:t>("Name: "+</w:t>
       </w:r>
       <w:proofErr w:type="spellStart"/>
-      <w:proofErr w:type="gramStart"/>
       <w:r>
         <w:t>getName</w:t>
       </w:r>
       <w:proofErr w:type="spellEnd"/>
       <w:r>
-        <w:t>(</w:t>
-      </w:r>
-      <w:proofErr w:type="gramEnd"/>
-      <w:r>
-        <w:t xml:space="preserve">) + "\t Age: " + </w:t>
-      </w:r>
-      <w:proofErr w:type="spellStart"/>
-      <w:proofErr w:type="gramStart"/>
+        <w:t xml:space="preserve">() + "\t Age: " + </w:t>
+      </w:r>
+      <w:proofErr w:type="spellStart"/>
       <w:r>
         <w:t>getAge</w:t>
       </w:r>
       <w:proofErr w:type="spellEnd"/>
       <w:r>
-        <w:t>(</w:t>
-      </w:r>
-      <w:proofErr w:type="gramEnd"/>
-      <w:r>
-        <w:t xml:space="preserve">) + "\t Email: " + </w:t>
-      </w:r>
-      <w:proofErr w:type="spellStart"/>
-      <w:proofErr w:type="gramStart"/>
+        <w:t xml:space="preserve">() + "\t Email: " + </w:t>
+      </w:r>
+      <w:proofErr w:type="spellStart"/>
       <w:r>
         <w:t>getEmail</w:t>
       </w:r>
       <w:proofErr w:type="spellEnd"/>
       <w:r>
-        <w:t>(</w:t>
-      </w:r>
-      <w:proofErr w:type="gramEnd"/>
-      <w:r>
-        <w:t>));</w:t>
+        <w:t>());</w:t>
       </w:r>
     </w:p>
     <w:p>
@@ -417,17 +339,12 @@
         <w:t xml:space="preserve">        //the </w:t>
       </w:r>
       <w:proofErr w:type="spellStart"/>
-      <w:proofErr w:type="gramStart"/>
       <w:r>
         <w:t>displayinfo</w:t>
       </w:r>
       <w:proofErr w:type="spellEnd"/>
       <w:r>
-        <w:t>(</w:t>
-      </w:r>
-      <w:proofErr w:type="gramEnd"/>
-      <w:r>
-        <w:t>) method uses the getter methods that were created earlier to print all the information taken by the user in order.</w:t>
+        <w:t>() method uses the getter methods that were created earlier to print all the information taken by the user in order.</w:t>
       </w:r>
     </w:p>
     <w:p>
@@ -452,13 +369,8 @@
         <w:t xml:space="preserve">import </w:t>
       </w:r>
       <w:proofErr w:type="spellStart"/>
-      <w:proofErr w:type="gramStart"/>
-      <w:r>
-        <w:t>java.util</w:t>
-      </w:r>
-      <w:proofErr w:type="gramEnd"/>
-      <w:r>
-        <w:t>.Scanner</w:t>
+      <w:r>
+        <w:t>java.util.Scanner</w:t>
       </w:r>
       <w:proofErr w:type="spellEnd"/>
       <w:r>
@@ -480,11 +392,7 @@
     </w:p>
     <w:p>
       <w:r>
-        <w:t>    public static void main (String</w:t>
-      </w:r>
-      <w:proofErr w:type="gramStart"/>
-      <w:r>
-        <w:t>[]</w:t>
+        <w:t>    public static void main (String[]</w:t>
       </w:r>
       <w:proofErr w:type="spellStart"/>
       <w:r>
@@ -494,32 +402,15 @@
       <w:r>
         <w:t>){</w:t>
       </w:r>
-      <w:proofErr w:type="gramEnd"/>
-    </w:p>
-    <w:p>
-      <w:r>
-        <w:t xml:space="preserve">        Scanner input = new </w:t>
-      </w:r>
-      <w:proofErr w:type="gramStart"/>
-      <w:r>
-        <w:t>Scanner(</w:t>
-      </w:r>
-      <w:proofErr w:type="gramEnd"/>
-      <w:r>
-        <w:t>System.in);</w:t>
-      </w:r>
-    </w:p>
-    <w:p>
-      <w:r>
-        <w:t xml:space="preserve">        Person p1 = new </w:t>
-      </w:r>
-      <w:proofErr w:type="gramStart"/>
-      <w:r>
-        <w:t>Person(</w:t>
-      </w:r>
-      <w:proofErr w:type="gramEnd"/>
-      <w:r>
-        <w:t>);</w:t>
+    </w:p>
+    <w:p>
+      <w:r>
+        <w:t>        Scanner input = new Scanner(System.in);</w:t>
+      </w:r>
+    </w:p>
+    <w:p>
+      <w:r>
+        <w:t>        Person p1 = new Person();</w:t>
       </w:r>
     </w:p>
     <w:p/>
@@ -552,27 +443,17 @@
         <w:t xml:space="preserve">        n = </w:t>
       </w:r>
       <w:proofErr w:type="spellStart"/>
-      <w:proofErr w:type="gramStart"/>
       <w:r>
         <w:t>input.nextLine</w:t>
       </w:r>
       <w:proofErr w:type="spellEnd"/>
-      <w:proofErr w:type="gramEnd"/>
       <w:r>
         <w:t>();</w:t>
       </w:r>
     </w:p>
     <w:p>
       <w:r>
-        <w:t>        p</w:t>
-      </w:r>
-      <w:proofErr w:type="gramStart"/>
-      <w:r>
-        <w:t>1.setName</w:t>
-      </w:r>
-      <w:proofErr w:type="gramEnd"/>
-      <w:r>
-        <w:t>(n);</w:t>
+        <w:t>        p1.setName(n);</w:t>
       </w:r>
     </w:p>
     <w:p/>
@@ -600,27 +481,17 @@
         <w:t xml:space="preserve">        a = </w:t>
       </w:r>
       <w:proofErr w:type="spellStart"/>
-      <w:proofErr w:type="gramStart"/>
       <w:r>
         <w:t>input.nextInt</w:t>
       </w:r>
       <w:proofErr w:type="spellEnd"/>
-      <w:proofErr w:type="gramEnd"/>
       <w:r>
         <w:t>();</w:t>
       </w:r>
     </w:p>
     <w:p>
       <w:r>
-        <w:t>        p</w:t>
-      </w:r>
-      <w:proofErr w:type="gramStart"/>
-      <w:r>
-        <w:t>1.setAge</w:t>
-      </w:r>
-      <w:proofErr w:type="gramEnd"/>
-      <w:r>
-        <w:t>(a);</w:t>
+        <w:t>        p1.setAge(a);</w:t>
       </w:r>
     </w:p>
     <w:p>
@@ -628,12 +499,10 @@
         <w:t xml:space="preserve">        </w:t>
       </w:r>
       <w:proofErr w:type="spellStart"/>
-      <w:proofErr w:type="gramStart"/>
       <w:r>
         <w:t>input.nextLine</w:t>
       </w:r>
       <w:proofErr w:type="spellEnd"/>
-      <w:proofErr w:type="gramEnd"/>
       <w:r>
         <w:t>();</w:t>
       </w:r>
@@ -662,12 +531,10 @@
         <w:t xml:space="preserve">        e = </w:t>
       </w:r>
       <w:proofErr w:type="spellStart"/>
-      <w:proofErr w:type="gramStart"/>
       <w:r>
         <w:t>input.nextLine</w:t>
       </w:r>
       <w:proofErr w:type="spellEnd"/>
-      <w:proofErr w:type="gramEnd"/>
       <w:r>
         <w:t>();</w:t>
       </w:r>
@@ -675,29 +542,13 @@
     <w:p>
       <w:r>
         <w:lastRenderedPageBreak/>
-        <w:t>        p</w:t>
-      </w:r>
-      <w:proofErr w:type="gramStart"/>
-      <w:r>
-        <w:t>1.setEmail</w:t>
-      </w:r>
-      <w:proofErr w:type="gramEnd"/>
-      <w:r>
-        <w:t>(e);</w:t>
-      </w:r>
-    </w:p>
-    <w:p/>
-    <w:p>
-      <w:r>
-        <w:t>        p</w:t>
-      </w:r>
-      <w:proofErr w:type="gramStart"/>
-      <w:r>
-        <w:t>1.displayinfo</w:t>
-      </w:r>
-      <w:proofErr w:type="gramEnd"/>
-      <w:r>
-        <w:t>();</w:t>
+        <w:t>        p1.setEmail(e);</w:t>
+      </w:r>
+    </w:p>
+    <w:p/>
+    <w:p>
+      <w:r>
+        <w:t>        p1.displayinfo();</w:t>
       </w:r>
     </w:p>
     <w:p>
@@ -717,7 +568,19 @@
       </w:r>
     </w:p>
     <w:p/>
-    <w:p/>
+    <w:p>
+      <w:r>
+        <w:t xml:space="preserve">GitHub Link: </w:t>
+      </w:r>
+      <w:hyperlink r:id="rId4" w:history="1">
+        <w:r>
+          <w:rPr>
+            <w:rStyle w:val="Hyperlink"/>
+          </w:rPr>
+          <w:t>https://github.com/fragososean/Fragoso-Sean-CMP129-Week02-Lab02.git</w:t>
+        </w:r>
+      </w:hyperlink>
+    </w:p>
     <w:sectPr>
       <w:pgSz w:w="12240" w:h="15840"/>
       <w:pgMar w:top="1440" w:right="1440" w:bottom="1440" w:left="1440" w:header="720" w:footer="720" w:gutter="0"/>
@@ -1644,6 +1507,29 @@
       <w:spacing w:val="5"/>
     </w:rPr>
   </w:style>
+  <w:style w:type="character" w:styleId="Hyperlink">
+    <w:name w:val="Hyperlink"/>
+    <w:basedOn w:val="DefaultParagraphFont"/>
+    <w:uiPriority w:val="99"/>
+    <w:unhideWhenUsed/>
+    <w:rsid w:val="009E1FE8"/>
+    <w:rPr>
+      <w:color w:val="467886" w:themeColor="hyperlink"/>
+      <w:u w:val="single"/>
+    </w:rPr>
+  </w:style>
+  <w:style w:type="character" w:styleId="UnresolvedMention">
+    <w:name w:val="Unresolved Mention"/>
+    <w:basedOn w:val="DefaultParagraphFont"/>
+    <w:uiPriority w:val="99"/>
+    <w:semiHidden/>
+    <w:unhideWhenUsed/>
+    <w:rsid w:val="009E1FE8"/>
+    <w:rPr>
+      <w:color w:val="605E5C"/>
+      <w:shd w:val="clear" w:color="auto" w:fill="E1DFDD"/>
+    </w:rPr>
+  </w:style>
 </w:styles>
 </file>
 

</xml_diff>